<commit_message>
Dodanie wskazania na repo Git
</commit_message>
<xml_diff>
--- a/docs/US P System obsługi warsztatu samochodowego.docx
+++ b/docs/US P System obsługi warsztatu samochodowego.docx
@@ -330,6 +330,77 @@
                 <w:szCs w:val="24"/>
               </w:rPr>
               <w:t>16.06.2026</w:t>
+            </w:r>
+          </w:p>
+        </w:tc>
+        <w:tc>
+          <w:tcPr>
+            <w:tcW w:w="2706" w:type="dxa"/>
+          </w:tcPr>
+          <w:p>
+            <w:pPr>
+              <w:spacing w:before="240" w:after="240"/>
+              <w:jc w:val="left"/>
+              <w:rPr>
+                <w:rFonts w:ascii="Calibri" w:hAnsi="Calibri" w:cs="Calibri"/>
+                <w:szCs w:val="24"/>
+              </w:rPr>
+            </w:pPr>
+          </w:p>
+        </w:tc>
+      </w:tr>
+      <w:tr>
+        <w:tc>
+          <w:tcPr>
+            <w:tcW w:w="1939" w:type="dxa"/>
+          </w:tcPr>
+          <w:p>
+            <w:pPr>
+              <w:spacing w:before="240" w:after="240"/>
+              <w:jc w:val="left"/>
+              <w:rPr>
+                <w:rFonts w:ascii="Calibri" w:hAnsi="Calibri" w:cs="Calibri"/>
+                <w:szCs w:val="24"/>
+              </w:rPr>
+            </w:pPr>
+            <w:r>
+              <w:rPr>
+                <w:rFonts w:ascii="Calibri" w:hAnsi="Calibri" w:cs="Calibri"/>
+                <w:szCs w:val="24"/>
+              </w:rPr>
+              <w:t>Repozytorium</w:t>
+            </w:r>
+          </w:p>
+        </w:tc>
+        <w:tc>
+          <w:tcPr>
+            <w:tcW w:w="4417" w:type="dxa"/>
+          </w:tcPr>
+          <w:p>
+            <w:pPr>
+              <w:spacing w:before="240" w:after="240"/>
+              <w:jc w:val="left"/>
+              <w:rPr>
+                <w:rFonts w:ascii="Calibri" w:hAnsi="Calibri" w:cs="Calibri"/>
+                <w:szCs w:val="24"/>
+              </w:rPr>
+            </w:pPr>
+            <w:hyperlink r:id="rId7" w:history="1">
+              <w:r>
+                <w:rPr>
+                  <w:rStyle w:val="Hipercze"/>
+                  <w:rFonts w:ascii="Calibri" w:hAnsi="Calibri" w:cs="Calibri"/>
+                  <w:szCs w:val="24"/>
+                </w:rPr>
+                <w:t>https://github.com/Tech-Bank/car-service.git</w:t>
+              </w:r>
+            </w:hyperlink>
+            <w:r>
+              <w:rPr>
+                <w:rFonts w:ascii="Calibri" w:hAnsi="Calibri" w:cs="Calibri"/>
+                <w:szCs w:val="24"/>
+              </w:rPr>
+              <w:t xml:space="preserve"> </w:t>
             </w:r>
           </w:p>
         </w:tc>
@@ -2711,7 +2782,7 @@
                     <pic:cNvPicPr/>
                   </pic:nvPicPr>
                   <pic:blipFill>
-                    <a:blip r:embed="rId7"/>
+                    <a:blip r:embed="rId8"/>
                     <a:stretch>
                       <a:fillRect/>
                     </a:stretch>
@@ -2966,7 +3037,7 @@
                     <pic:cNvPicPr/>
                   </pic:nvPicPr>
                   <pic:blipFill>
-                    <a:blip r:embed="rId8"/>
+                    <a:blip r:embed="rId9"/>
                     <a:stretch>
                       <a:fillRect/>
                     </a:stretch>
@@ -3049,7 +3120,7 @@
                     </pic:cNvPicPr>
                   </pic:nvPicPr>
                   <pic:blipFill>
-                    <a:blip r:embed="rId9">
+                    <a:blip r:embed="rId10">
                       <a:extLst>
                         <a:ext uri="{28A0092B-C50C-407E-A947-70E740481C1C}">
                           <a14:useLocalDpi xmlns:a14="http://schemas.microsoft.com/office/drawing/2010/main" val="0"/>
@@ -3164,7 +3235,7 @@
                     <pic:cNvPicPr/>
                   </pic:nvPicPr>
                   <pic:blipFill>
-                    <a:blip r:embed="rId10"/>
+                    <a:blip r:embed="rId11"/>
                     <a:stretch>
                       <a:fillRect/>
                     </a:stretch>
@@ -3209,7 +3280,7 @@
                     <pic:cNvPicPr/>
                   </pic:nvPicPr>
                   <pic:blipFill>
-                    <a:blip r:embed="rId11"/>
+                    <a:blip r:embed="rId12"/>
                     <a:stretch>
                       <a:fillRect/>
                     </a:stretch>
@@ -3254,7 +3325,7 @@
                     <pic:cNvPicPr/>
                   </pic:nvPicPr>
                   <pic:blipFill>
-                    <a:blip r:embed="rId12"/>
+                    <a:blip r:embed="rId13"/>
                     <a:stretch>
                       <a:fillRect/>
                     </a:stretch>
@@ -3300,7 +3371,7 @@
                     <pic:cNvPicPr/>
                   </pic:nvPicPr>
                   <pic:blipFill>
-                    <a:blip r:embed="rId13"/>
+                    <a:blip r:embed="rId14"/>
                     <a:stretch>
                       <a:fillRect/>
                     </a:stretch>
@@ -3357,7 +3428,7 @@
                     </pic:cNvPicPr>
                   </pic:nvPicPr>
                   <pic:blipFill>
-                    <a:blip r:embed="rId14">
+                    <a:blip r:embed="rId15">
                       <a:extLst>
                         <a:ext uri="{28A0092B-C50C-407E-A947-70E740481C1C}">
                           <a14:useLocalDpi xmlns:a14="http://schemas.microsoft.com/office/drawing/2010/main" val="0"/>
@@ -3414,7 +3485,7 @@
                     <pic:cNvPicPr/>
                   </pic:nvPicPr>
                   <pic:blipFill>
-                    <a:blip r:embed="rId15"/>
+                    <a:blip r:embed="rId16"/>
                     <a:stretch>
                       <a:fillRect/>
                     </a:stretch>
@@ -3459,7 +3530,7 @@
                     <pic:cNvPicPr/>
                   </pic:nvPicPr>
                   <pic:blipFill>
-                    <a:blip r:embed="rId16"/>
+                    <a:blip r:embed="rId17"/>
                     <a:stretch>
                       <a:fillRect/>
                     </a:stretch>
@@ -3504,7 +3575,7 @@
                     <pic:cNvPicPr/>
                   </pic:nvPicPr>
                   <pic:blipFill>
-                    <a:blip r:embed="rId17"/>
+                    <a:blip r:embed="rId18"/>
                     <a:stretch>
                       <a:fillRect/>
                     </a:stretch>
@@ -3550,7 +3621,7 @@
                     <pic:cNvPicPr/>
                   </pic:nvPicPr>
                   <pic:blipFill>
-                    <a:blip r:embed="rId18"/>
+                    <a:blip r:embed="rId19"/>
                     <a:stretch>
                       <a:fillRect/>
                     </a:stretch>
@@ -5051,6 +5122,18 @@
       <w:ind w:left="480"/>
     </w:pPr>
   </w:style>
+  <w:style w:type="character" w:styleId="Nierozpoznanawzmianka">
+    <w:name w:val="Unresolved Mention"/>
+    <w:basedOn w:val="Domylnaczcionkaakapitu"/>
+    <w:uiPriority w:val="99"/>
+    <w:semiHidden/>
+    <w:unhideWhenUsed/>
+    <w:rsid w:val="00EC5698"/>
+    <w:rPr>
+      <w:color w:val="605E5C"/>
+      <w:shd w:val="clear" w:color="auto" w:fill="E1DFDD"/>
+    </w:rPr>
+  </w:style>
 </w:styles>
 </file>
 

</xml_diff>